<commit_message>
build(inbox/aan): regenerate derivatives after the content-correctness burndown
Re-rendered the tracked deliverables from the fixed sources:
- 163 figure PNGs re-rasterized from their SVG sources (+ provenance sidecars)
- 12 Vol VII/IX briefing decks (.pptx) regenerated from their specs
- 14 tracked Vol VII/IX book + governance .docx re-rendered via Pandoc
- distribution kit refreshed -> AAN_Federal_Series_Complete_2026-07-15_1503ET.zip

Source content was merged earlier in #1207-#1216; this syncs the binary
derivatives to it. Verified docx carry the fixes.

Co-Authored-By: Claude Fable 5 <noreply@anthropic.com>
</commit_message>
<xml_diff>
--- a/inbox/Application Aware Networking/Vol_IX_Book_00_FedAAN_Day2_Operations_Overview.docx
+++ b/inbox/Application Aware Networking/Vol_IX_Book_00_FedAAN_Day2_Operations_Overview.docx
@@ -232,6 +232,53 @@
         <w:t xml:space="preserve">; other CSPs and higher boundaries are deferred, consistent with the rest of the current program.</w:t>
       </w:r>
     </w:p>
+    <w:p>
+      <w:pPr>
+        <w:pStyle w:val="CalloutNote"/>
+      </w:pPr>
+      <w:r>
+        <w:t xml:space="preserve">Volume IX runs on the same ServiceNow Government Cloud coordination hub as Volume VII, which holds</w:t>
+      </w:r>
+      <w:r>
+        <w:t xml:space="preserve"> </w:t>
+      </w:r>
+      <w:r>
+        <w:rPr>
+          <w:b/>
+          <w:bCs/>
+        </w:rPr>
+        <w:t xml:space="preserve">FedRAMP High</w:t>
+      </w:r>
+      <w:r>
+        <w:t xml:space="preserve"> </w:t>
+      </w:r>
+      <w:r>
+        <w:t xml:space="preserve">authorization. The High-on-Moderate boundary treatment — why a High-authorized hub coordinating a Moderate boundary is a conservative, documented posture — is stated once in</w:t>
+      </w:r>
+      <w:r>
+        <w:t xml:space="preserve"> </w:t>
+      </w:r>
+      <w:r>
+        <w:rPr>
+          <w:b/>
+          <w:bCs/>
+        </w:rPr>
+        <w:t xml:space="preserve">Vol VII Book 00 §</w:t>
+      </w:r>
+      <w:r>
+        <w:rPr>
+          <w:b/>
+          <w:bCs/>
+        </w:rPr>
+        <w:t xml:space="preserve">“Authorization Boundary Treatment — ServiceNow High-on-Moderate”</w:t>
+      </w:r>
+      <w:r>
+        <w:t xml:space="preserve"> </w:t>
+      </w:r>
+      <w:r>
+        <w:t xml:space="preserve">and inherited here without restatement.</w:t>
+      </w:r>
+    </w:p>
     <w:bookmarkEnd w:id="10"/>
     <w:bookmarkStart w:id="11" w:name="what-this-volume-addresses"/>
     <w:p>
@@ -247,7 +294,7 @@
         <w:pStyle w:val="FirstParagraph"/>
       </w:pPr>
       <w:r>
-        <w:t xml:space="preserve">Volume VII proved that ServiceNow can operate</w:t>
+        <w:t xml:space="preserve">Volume VII established the pattern for operating</w:t>
       </w:r>
       <w:r>
         <w:t xml:space="preserve"> </w:t>
@@ -1092,7 +1139,7 @@
         <w:pStyle w:val="FirstParagraph"/>
       </w:pPr>
       <w:r>
-        <w:t xml:space="preserve">This overview establishes the day-2 operations layer of the series, extending Volume VII’s coordination doctrine. Functions and planes are named, not organizations; ServiceNow is the deployed coordination example; the substitution path is preserved where a workflow platform is interchangeable. Every book carries a Date Code. The volume map above is authored as committed house-style SVG per ADR-093, rendered to PNG at 3× for crisp</w:t>
+        <w:t xml:space="preserve">This overview establishes the day-2 operations layer of the series, extending Volume VII’s coordination doctrine. Functions and planes are named, not organizations; ServiceNow is the deployed coordination example; the substitution path is preserved where a workflow platform is interchangeable. Every book carries a Date Code. The volume map above is authored as committed house-style SVG, rendered to PNG at 3× for crisp</w:t>
       </w:r>
       <w:r>
         <w:t xml:space="preserve"> </w:t>

</xml_diff>

<commit_message>
build(inbox/aan): regenerate derivatives after the content-correctness burndown (#1217)
Re-rendered the tracked deliverables from the fixed sources:
- 163 figure PNGs re-rasterized from their SVG sources (+ provenance sidecars)
- 12 Vol VII/IX briefing decks (.pptx) regenerated from their specs
- 14 tracked Vol VII/IX book + governance .docx re-rendered via Pandoc
- distribution kit refreshed -> AAN_Federal_Series_Complete_2026-07-15_1503ET.zip

Source content was merged earlier in #1207-#1216; this syncs the binary
derivatives to it. Verified docx carry the fixes.

Co-authored-by: Claude Fable 5 <noreply@anthropic.com>
</commit_message>
<xml_diff>
--- a/inbox/Application Aware Networking/Vol_IX_Book_00_FedAAN_Day2_Operations_Overview.docx
+++ b/inbox/Application Aware Networking/Vol_IX_Book_00_FedAAN_Day2_Operations_Overview.docx
@@ -232,6 +232,53 @@
         <w:t xml:space="preserve">; other CSPs and higher boundaries are deferred, consistent with the rest of the current program.</w:t>
       </w:r>
     </w:p>
+    <w:p>
+      <w:pPr>
+        <w:pStyle w:val="CalloutNote"/>
+      </w:pPr>
+      <w:r>
+        <w:t xml:space="preserve">Volume IX runs on the same ServiceNow Government Cloud coordination hub as Volume VII, which holds</w:t>
+      </w:r>
+      <w:r>
+        <w:t xml:space="preserve"> </w:t>
+      </w:r>
+      <w:r>
+        <w:rPr>
+          <w:b/>
+          <w:bCs/>
+        </w:rPr>
+        <w:t xml:space="preserve">FedRAMP High</w:t>
+      </w:r>
+      <w:r>
+        <w:t xml:space="preserve"> </w:t>
+      </w:r>
+      <w:r>
+        <w:t xml:space="preserve">authorization. The High-on-Moderate boundary treatment — why a High-authorized hub coordinating a Moderate boundary is a conservative, documented posture — is stated once in</w:t>
+      </w:r>
+      <w:r>
+        <w:t xml:space="preserve"> </w:t>
+      </w:r>
+      <w:r>
+        <w:rPr>
+          <w:b/>
+          <w:bCs/>
+        </w:rPr>
+        <w:t xml:space="preserve">Vol VII Book 00 §</w:t>
+      </w:r>
+      <w:r>
+        <w:rPr>
+          <w:b/>
+          <w:bCs/>
+        </w:rPr>
+        <w:t xml:space="preserve">“Authorization Boundary Treatment — ServiceNow High-on-Moderate”</w:t>
+      </w:r>
+      <w:r>
+        <w:t xml:space="preserve"> </w:t>
+      </w:r>
+      <w:r>
+        <w:t xml:space="preserve">and inherited here without restatement.</w:t>
+      </w:r>
+    </w:p>
     <w:bookmarkEnd w:id="10"/>
     <w:bookmarkStart w:id="11" w:name="what-this-volume-addresses"/>
     <w:p>
@@ -247,7 +294,7 @@
         <w:pStyle w:val="FirstParagraph"/>
       </w:pPr>
       <w:r>
-        <w:t xml:space="preserve">Volume VII proved that ServiceNow can operate</w:t>
+        <w:t xml:space="preserve">Volume VII established the pattern for operating</w:t>
       </w:r>
       <w:r>
         <w:t xml:space="preserve"> </w:t>
@@ -1092,7 +1139,7 @@
         <w:pStyle w:val="FirstParagraph"/>
       </w:pPr>
       <w:r>
-        <w:t xml:space="preserve">This overview establishes the day-2 operations layer of the series, extending Volume VII’s coordination doctrine. Functions and planes are named, not organizations; ServiceNow is the deployed coordination example; the substitution path is preserved where a workflow platform is interchangeable. Every book carries a Date Code. The volume map above is authored as committed house-style SVG per ADR-093, rendered to PNG at 3× for crisp</w:t>
+        <w:t xml:space="preserve">This overview establishes the day-2 operations layer of the series, extending Volume VII’s coordination doctrine. Functions and planes are named, not organizations; ServiceNow is the deployed coordination example; the substitution path is preserved where a workflow platform is interchangeable. Every book carries a Date Code. The volume map above is authored as committed house-style SVG, rendered to PNG at 3× for crisp</w:t>
       </w:r>
       <w:r>
         <w:t xml:space="preserve"> </w:t>

</xml_diff>